<commit_message>
Production candidate. Migrate to dev
promote local -> dev (2026-09-08T23:33:35.921329+00:00)
</commit_message>
<xml_diff>
--- a/architecture/EngineeringRuleEnforcement/ArchitectureDesignAndAuditDocs/CH-EPIC8-Feachure-002-EngineeringRulesEnforcement-designV32.docx
+++ b/architecture/EngineeringRuleEnforcement/ArchitectureDesignAndAuditDocs/CH-EPIC8-Feachure-002-EngineeringRulesEnforcement-designV32.docx
@@ -3980,63 +3980,11 @@
           <w14:ligatures w14:val="standardContextual"/>
         </w:rPr>
       </w:pPr>
-      <w:hyperlink w:anchor="_Toc238315627" w:history="1">
-        <w:r>
-          <w:rPr>
-            <w:rStyle w:val="Hyperlink"/>
-            <w:noProof/>
-          </w:rPr>
-          <w:t>Rule-009: Separation of concerns between React display, plumbing JS/HTML, and Python tools</w:t>
-        </w:r>
-        <w:r>
-          <w:rPr>
-            <w:noProof/>
-            <w:webHidden/>
-          </w:rPr>
-          <w:tab/>
-        </w:r>
-        <w:r>
-          <w:rPr>
-            <w:noProof/>
-            <w:webHidden/>
-          </w:rPr>
-          <w:fldChar w:fldCharType="begin"/>
-        </w:r>
-        <w:r>
-          <w:rPr>
-            <w:noProof/>
-            <w:webHidden/>
-          </w:rPr>
-          <w:instrText xml:space="preserve"> PAGEREF _Toc238315627 \h </w:instrText>
-        </w:r>
-        <w:r>
-          <w:rPr>
-            <w:noProof/>
-            <w:webHidden/>
-          </w:rPr>
-        </w:r>
-        <w:r>
-          <w:rPr>
-            <w:noProof/>
-            <w:webHidden/>
-          </w:rPr>
-          <w:fldChar w:fldCharType="separate"/>
-        </w:r>
-        <w:r>
-          <w:rPr>
-            <w:noProof/>
-            <w:webHidden/>
-          </w:rPr>
-          <w:t>51</w:t>
-        </w:r>
-        <w:r>
-          <w:rPr>
-            <w:noProof/>
-            <w:webHidden/>
-          </w:rPr>
-          <w:fldChar w:fldCharType="end"/>
-        </w:r>
-      </w:hyperlink>
+      <w:r>
+        <w:t>Rule-065-ENF-007: Display, plumbing and logic stay separate</w:t>
+        <w:tab/>
+        <w:t>51</w:t>
+      </w:r>
     </w:p>
     <w:p>
       <w:pPr>
@@ -21696,22 +21644,14 @@
       <w:pPr>
         <w:pStyle w:val="Heading2"/>
       </w:pPr>
-      <w:bookmarkStart w:id="52" w:name="_Toc238315627"/>
-      <w:r>
-        <w:rPr>
-          <w:color w:val="000000"/>
-        </w:rPr>
-        <w:lastRenderedPageBreak/>
-        <w:t>Rule-009: Separation of concerns between React display, plumbing JS/HTML, and Python tools</w:t>
-      </w:r>
-      <w:bookmarkEnd w:id="52"/>
-    </w:p>
-    <w:p>
-      <w:r>
-        <w:rPr>
-          <w:color w:val="000000"/>
-        </w:rPr>
-        <w:t>Enforces front-end architectural separation: non-React JS/HTML must not author display, React must not change persistent state, and non-React JS/HTML must not carry business logic.</w:t>
+      <w:r>
+        <w:t>Rule-065-ENF-007: Display, plumbing and logic stay separate</w:t>
+      </w:r>
+    </w:p>
+    <w:p>
+      <w:pPr/>
+      <w:r>
+        <w:t>Three tiers, and no tier does another's work. React owns display authoring. Tools own business logic and persistent state. Authored .js and .html are plumbing: they courier content between the two and author neither. A .tsx file is a display file -- React's alternative to .html -- and is held to the display tier's obligations, not exempted from them.</w:t>
       </w:r>
     </w:p>
     <w:p>
@@ -21719,10 +21659,7 @@
         <w:pStyle w:val="ListBullet"/>
       </w:pPr>
       <w:r>
-        <w:rPr>
-          <w:color w:val="000000"/>
-        </w:rPr>
-        <w:t>Statements: 1, 2, 3</w:t>
+        <w:t>Statements: 7</w:t>
       </w:r>
     </w:p>
     <w:p>
@@ -21730,9 +21667,6 @@
         <w:pStyle w:val="ListBullet"/>
       </w:pPr>
       <w:r>
-        <w:rPr>
-          <w:color w:val="000000"/>
-        </w:rPr>
         <w:t>Hook Trigger: pre-commit</w:t>
       </w:r>
     </w:p>
@@ -21741,10 +21675,21 @@
         <w:pStyle w:val="ListBullet"/>
       </w:pPr>
       <w:r>
-        <w:rPr>
-          <w:color w:val="000000"/>
-        </w:rPr>
-        <w:t>Enforcement Entries:</w:t>
+        <w:t>Worker: architecture/EngineeringRuleEnforcement/code/scan_separation_of_concerns_worker.py | Timeout: 120s</w:t>
+      </w:r>
+    </w:p>
+    <w:p>
+      <w:pPr>
+        <w:pStyle w:val="ListBullet"/>
+      </w:pPr>
+      <w:r>
+        <w:t>Epic: EPIC-008-F-002-S-016</w:t>
+      </w:r>
+    </w:p>
+    <w:p>
+      <w:pPr/>
+      <w:r>
+        <w:t>Three checks.</w:t>
       </w:r>
     </w:p>
     <w:p>
@@ -21752,32 +21697,79 @@
         <w:pStyle w:val="ListNumber2"/>
       </w:pPr>
       <w:r>
-        <w:rPr>
-          <w:color w:val="000000"/>
-        </w:rPr>
-        <w:t>ID: Rule-009-ENF-001 | Hook: pre-commit | Worker: architecture/EngineeringRuleEnforcement/code/scan_separation_of_concerns_worker.py | Timeout: 120s</w:t>
+        <w:t>_scan_display_authoring -- authored .js and .html author no display content, including the wrapper's own runtime driver. A file the manifest assigns to the static_pages package is a page and authors its own display.</w:t>
       </w:r>
     </w:p>
     <w:p>
       <w:pPr>
-        <w:pStyle w:val="ListBullet"/>
+        <w:pStyle w:val="ListNumber2"/>
       </w:pPr>
       <w:r>
-        <w:rPr>
-          <w:color w:val="008080"/>
-        </w:rPr>
-        <w:t>Carried by Rule-065-ENF-007.</w:t>
+        <w:t>_scan_react_persistence -- the React application changes no persistent state directly. Every change originates from a /gate call dispatched through ClientRouter.</w:t>
       </w:r>
     </w:p>
     <w:p>
       <w:pPr>
-        <w:pStyle w:val="ListBullet"/>
+        <w:pStyle w:val="ListNumber2"/>
       </w:pPr>
       <w:r>
-        <w:rPr>
-          <w:color w:val="000000"/>
-        </w:rPr>
-        <w:t>Epic: EPIC-008-F-002-S-016</w:t>
+        <w:t>_scan_business_logic -- no display file carries business logic. Scoped to .js, .html, .tsx and .ts. Until 2026-09-08 it was scoped to .js and .html only, so React was never inspected and 38 violations stood in the widgets with the gate reporting none.</w:t>
+      </w:r>
+    </w:p>
+    <w:p>
+      <w:pPr/>
+      <w:r>
+        <w:t>How business logic is recognised in a display file. Matching domain words does not work on React: a widget that paints providers says 'provider' on nearly every line, and 183 such matches would force an exclusion list, which is worse than no rule. What separates display from logic is not the subject a file discusses but whether it decides. The act is narrow and visible -- the display tier tests a value it worked out, where the tier owning the fact could have sent the answer. Boolean(first_npi) is worked out; data.has_previous is sent.</w:t>
+      </w:r>
+    </w:p>
+    <w:p>
+      <w:pPr/>
+      <w:r>
+        <w:t>The defect that motivated it. A Previous control appeared on the first page of provider results, because the widget decided a previous page existed wherever a first row existed -- and page one has a first row like every other page. The search already computed the answer and the gateway dropped it from the event, so the widget had nothing to read and worked it out instead. Every violation in this class has that shape: a value the tool could have stated, inferred downstream.</w:t>
+      </w:r>
+    </w:p>
+    <w:p>
+      <w:pPr/>
+      <w:r>
+        <w:t>What is not business logic, and is not flagged.</w:t>
+      </w:r>
+    </w:p>
+    <w:p>
+      <w:pPr>
+        <w:pStyle w:val="ListNumber2"/>
+      </w:pPr>
+      <w:r>
+        <w:t>Managing a display cache. A widget handed a list is handed the cache of it, and which slice is on screen is display work in the same way scrolling is. Paging is client-managed or tool-managed; where the data is cached decides which, and the cursor is recorded in the session either way. A list not cached in the display tier has nothing to manage: the boundary is a fact about a query the tool holds.</w:t>
+      </w:r>
+    </w:p>
+    <w:p>
+      <w:pPr>
+        <w:pStyle w:val="ListNumber2"/>
+      </w:pPr>
+      <w:r>
+        <w:t>Reading an answer that was sent -- off a field or out of a map, cast or compared to a boolean. This is the shape the rule asks widgets for.</w:t>
+      </w:r>
+    </w:p>
+    <w:p>
+      <w:pPr>
+        <w:pStyle w:val="ListNumber2"/>
+      </w:pPr>
+      <w:r>
+        <w:t>Guarding the shape of what arrived, taking a default when a field is absent, and fitting text to the space it has. None states a rule about the subject.</w:t>
+      </w:r>
+    </w:p>
+    <w:p>
+      <w:pPr>
+        <w:pStyle w:val="ListNumber2"/>
+      </w:pPr>
+      <w:r>
+        <w:t>Recognising which message this is. A widget listens to one stream and must know whether an event is addressed to it; that is delivery, the same act ClientRouter performs on the way in.</w:t>
+      </w:r>
+    </w:p>
+    <w:p>
+      <w:pPr/>
+      <w:r>
+        <w:t>Scope note. A .tsx file is display and the rule statement needs no clause admitting cache management, because managing a display cache is display work and already within what React owns.</w:t>
       </w:r>
     </w:p>
     <w:p/>

</xml_diff>